<commit_message>
Trim report: drop intro/tech-stack, shorten conclusions to two bullets
</commit_message>
<xml_diff>
--- a/Informe_CRUD_API_Pizzas.docx
+++ b/Informe_CRUD_API_Pizzas.docx
@@ -159,123 +159,7 @@
         <w:pStyle w:val="Heading2"/>
       </w:pPr>
       <w:r>
-        <w:t>1. Introducción</w:t>
-      </w:r>
-    </w:p>
-    <w:p>
-      <w:pPr>
-        <w:spacing w:after="200"/>
-        <w:rPr>
-          <w:rFonts w:ascii="Times New Roman" w:hAnsi="Times New Roman" w:cs="Times New Roman"/>
-          <w:sz w:val="24"/>
-          <w:szCs w:val="24"/>
-          <w:lang w:val="es-EC"/>
-        </w:rPr>
-      </w:pPr>
-      <w:r>
-        <w:rPr>
-          <w:rFonts w:ascii="Times New Roman" w:hAnsi="Times New Roman" w:cs="Times New Roman"/>
-          <w:sz w:val="24"/>
-          <w:szCs w:val="24"/>
-          <w:lang w:val="es-EC"/>
-        </w:rPr>
-        <w:t xml:space="preserve">Este informe documenta el funcionamiento de una aplicación móvil desarrollada en Flutter que implementa un CRUD (Crear, Leer, Actualizar, Eliminar) consumiendo un API REST propio, en lugar de una base de datos local. El modelo de datos es maestro-detalle: Pizza (maestro) e Ingrediente (catálogo), relacionados muchos a muchos mediante una cantidad por ingrediente.</w:t>
-      </w:r>
-    </w:p>
-    <w:p>
-      <w:pPr>
-        <w:pStyle w:val="Heading2"/>
-      </w:pPr>
-      <w:r>
-        <w:t>2. Tecnologías utilizadas</w:t>
-      </w:r>
-    </w:p>
-    <w:p>
-      <w:pPr>
-        <w:spacing w:after="200"/>
-        <w:rPr>
-          <w:rFonts w:ascii="Times New Roman" w:hAnsi="Times New Roman" w:cs="Times New Roman"/>
-          <w:sz w:val="24"/>
-          <w:szCs w:val="24"/>
-          <w:lang w:val="es-EC"/>
-        </w:rPr>
-      </w:pPr>
-      <w:r>
-        <w:rPr>
-          <w:rFonts w:ascii="Times New Roman" w:hAnsi="Times New Roman" w:cs="Times New Roman"/>
-          <w:sz w:val="24"/>
-          <w:szCs w:val="24"/>
-          <w:lang w:val="es-EC"/>
-        </w:rPr>
-        <w:t xml:space="preserve">•  Flutter (Dart) + paquete http — cliente REST para consumir el API.</w:t>
-      </w:r>
-    </w:p>
-    <w:p>
-      <w:pPr>
-        <w:spacing w:after="200"/>
-        <w:rPr>
-          <w:rFonts w:ascii="Times New Roman" w:hAnsi="Times New Roman" w:cs="Times New Roman"/>
-          <w:sz w:val="24"/>
-          <w:szCs w:val="24"/>
-          <w:lang w:val="es-EC"/>
-        </w:rPr>
-      </w:pPr>
-      <w:r>
-        <w:rPr>
-          <w:rFonts w:ascii="Times New Roman" w:hAnsi="Times New Roman" w:cs="Times New Roman"/>
-          <w:sz w:val="24"/>
-          <w:szCs w:val="24"/>
-          <w:lang w:val="es-EC"/>
-        </w:rPr>
-        <w:t xml:space="preserve">•  Node.js + Express — framework del API REST.</w:t>
-      </w:r>
-    </w:p>
-    <w:p>
-      <w:pPr>
-        <w:spacing w:after="200"/>
-        <w:rPr>
-          <w:rFonts w:ascii="Times New Roman" w:hAnsi="Times New Roman" w:cs="Times New Roman"/>
-          <w:sz w:val="24"/>
-          <w:szCs w:val="24"/>
-          <w:lang w:val="es-EC"/>
-        </w:rPr>
-      </w:pPr>
-      <w:r>
-        <w:rPr>
-          <w:rFonts w:ascii="Times New Roman" w:hAnsi="Times New Roman" w:cs="Times New Roman"/>
-          <w:sz w:val="24"/>
-          <w:szCs w:val="24"/>
-          <w:lang w:val="es-EC"/>
-        </w:rPr>
-        <w:t xml:space="preserve">•  Sequelize + PostgreSQL — ORM y base de datos relacional del backend.</w:t>
-      </w:r>
-    </w:p>
-    <w:p>
-      <w:pPr>
-        <w:spacing w:after="200"/>
-        <w:rPr>
-          <w:rFonts w:ascii="Times New Roman" w:hAnsi="Times New Roman" w:cs="Times New Roman"/>
-          <w:sz w:val="24"/>
-          <w:szCs w:val="24"/>
-          <w:lang w:val="es-EC"/>
-        </w:rPr>
-      </w:pPr>
-      <w:r>
-        <w:rPr>
-          <w:rFonts w:ascii="Times New Roman" w:hAnsi="Times New Roman" w:cs="Times New Roman"/>
-          <w:sz w:val="24"/>
-          <w:szCs w:val="24"/>
-          <w:lang w:val="es-EC"/>
-        </w:rPr>
-        <w:t xml:space="preserve">•  Render — plataforma de despliegue del API (https://api-pizzas-7v98.onrender.com).</w:t>
-      </w:r>
-    </w:p>
-    <w:p>
-      <w:pPr>
-        <w:pStyle w:val="Heading2"/>
-      </w:pPr>
-      <w:r>
-        <w:t>3. Api de pizzas</w:t>
+        <w:t>1. Api de pizzas</w:t>
       </w:r>
     </w:p>
     <w:p>
@@ -1210,7 +1094,7 @@
         <w:pStyle w:val="Heading2"/>
       </w:pPr>
       <w:r>
-        <w:t>4. Funcionamiento de la aplicación móvil</w:t>
+        <w:t>2. Funcionamiento de la aplicación móvil</w:t>
       </w:r>
     </w:p>
     <w:p>
@@ -1218,7 +1102,7 @@
         <w:pStyle w:val="Heading3"/>
       </w:pPr>
       <w:r>
-        <w:t>4.1 Crear</w:t>
+        <w:t>2.1 Crear</w:t>
       </w:r>
     </w:p>
     <w:p>
@@ -1478,7 +1362,7 @@
         <w:pStyle w:val="Heading3"/>
       </w:pPr>
       <w:r>
-        <w:t>4.2 Leer</w:t>
+        <w:t>2.2 Leer</w:t>
       </w:r>
     </w:p>
     <w:p>
@@ -1612,7 +1496,7 @@
         <w:pStyle w:val="Heading3"/>
       </w:pPr>
       <w:r>
-        <w:t>4.3 Actualizar</w:t>
+        <w:t>2.3 Actualizar</w:t>
       </w:r>
     </w:p>
     <w:p>
@@ -1872,7 +1756,7 @@
         <w:pStyle w:val="Heading3"/>
       </w:pPr>
       <w:r>
-        <w:t>4.4 Eliminar</w:t>
+        <w:t>2.4 Eliminar</w:t>
       </w:r>
     </w:p>
     <w:p>
@@ -2132,7 +2016,7 @@
         <w:pStyle w:val="Heading2"/>
       </w:pPr>
       <w:r>
-        <w:t>5. Conclusiones</w:t>
+        <w:t>3. Conclusiones</w:t>
       </w:r>
     </w:p>
     <w:p>
@@ -2152,7 +2036,27 @@
           <w:szCs w:val="24"/>
           <w:lang w:val="es-EC"/>
         </w:rPr>
-        <w:t xml:space="preserve">Consumir un API REST propio permite separar completamente la lógica de negocio y persistencia (Node.js, Express, PostgreSQL) de la interfaz móvil (Flutter), habilitando que múltiples clientes (web, móvil, escritorio) compartan la misma fuente de datos. Se identificó y solucionó además una limitación de CORS en el API, necesaria para que clientes web puedan consumirla.</w:t>
+        <w:t xml:space="preserve">•  El API REST separa la lógica de negocio del cliente Flutter, permitiendo compartir los mismos datos entre varias plataformas.</w:t>
+      </w:r>
+    </w:p>
+    <w:p>
+      <w:pPr>
+        <w:spacing w:after="200"/>
+        <w:rPr>
+          <w:rFonts w:ascii="Times New Roman" w:hAnsi="Times New Roman" w:cs="Times New Roman"/>
+          <w:sz w:val="24"/>
+          <w:szCs w:val="24"/>
+          <w:lang w:val="es-EC"/>
+        </w:rPr>
+      </w:pPr>
+      <w:r>
+        <w:rPr>
+          <w:rFonts w:ascii="Times New Roman" w:hAnsi="Times New Roman" w:cs="Times New Roman"/>
+          <w:sz w:val="24"/>
+          <w:szCs w:val="24"/>
+          <w:lang w:val="es-EC"/>
+        </w:rPr>
+        <w:t xml:space="preserve">•  Se resolvió una limitación de CORS en el API para que clientes web pudieran consumirla.</w:t>
       </w:r>
     </w:p>
     <w:sectPr>

</xml_diff>